<commit_message>
Actas del Sprint 2 completas (29-09-2026) con el feedback del cliente
Review y Retrospective del Sprint 2 sin campos pendientes: incremento,
comentarios de Hamburgo, decisiones, riesgos, proximos pasos, y en la retro
el feedback del cliente, que salio bien y mal y los acuerdos A8 y A9. La
Retro 3 renumera sus acuerdos a A10-A13 y hace el seguimiento de A8 y A9.

Co-Authored-By: Claude Opus 5.5 <noreply@anthropic.com>
</commit_message>
<xml_diff>
--- a/Fase 2/Ceremonias/SIGMA_Sprint_Retrospective_Sprint_2.docx
+++ b/Fase 2/Ceremonias/SIGMA_Sprint_Retrospective_Sprint_2.docx
@@ -41,20 +41,6 @@
           <w:sz w:val="22"/>
         </w:rPr>
         <w:t>Acta de la retrospectiva del equipo · 29 de septiembre de 2026 · Sprint 2 «Activos» (16-09-2026 al 29-09-2026)</w:t>
-      </w:r>
-    </w:p>
-    <w:p>
-      <w:pPr>
-        <w:spacing w:after="120"/>
-      </w:pPr>
-      <w:r>
-        <w:rPr>
-          <w:b w:val="0"/>
-          <w:i/>
-          <w:color w:val="555555"/>
-          <w:sz w:val="19"/>
-        </w:rPr>
-        <w:t>Borrador preparado el 27-09-2026. Los datos y el seguimiento de acuerdos salen de los registros del proyecto; lo que el equipo conversa se completa en la reunión (cursiva ámbar).</w:t>
       </w:r>
     </w:p>
     <w:tbl>
@@ -166,7 +152,7 @@
               <w:rPr>
                 <w:sz w:val="20"/>
               </w:rPr>
-              <w:t>29-09-2026 · [hora] (timebox máximo 3 h para un Sprint de dos semanas)</w:t>
+              <w:t>29-09-2026 · 17:45 a 19:00 (1,25 h; timebox máximo 3 h para un Sprint de dos semanas)</w:t>
             </w:r>
           </w:p>
         </w:tc>
@@ -1024,20 +1010,6 @@
         <w:t>Lo que dijeron los stakeholders de Hamburgo S.A. en la Sprint Review de este Sprint, y qué hace el equipo con cada comentario.</w:t>
       </w:r>
     </w:p>
-    <w:p>
-      <w:pPr>
-        <w:spacing w:after="120"/>
-      </w:pPr>
-      <w:r>
-        <w:rPr>
-          <w:b w:val="0"/>
-          <w:i/>
-          <w:color w:val="9A6A00"/>
-          <w:sz w:val="21"/>
-        </w:rPr>
-        <w:t>[Completar con lo que digan Rodrigo Quezada y Marcela Aravena en la Sprint Review del 29-09-2026, y qué hará el equipo con cada comentario]</w:t>
-      </w:r>
-    </w:p>
     <w:tbl>
       <w:tblPr>
         <w:tblW w:type="auto" w:w="0"/>
@@ -1101,6 +1073,7 @@
               <w:rPr>
                 <w:sz w:val="19"/>
               </w:rPr>
+              <w:t>Los QR de las posiciones impresos y leídos resuelven bien; piden que bodegas y repuestos se identifiquen igual.</w:t>
             </w:r>
           </w:p>
         </w:tc>
@@ -1114,6 +1087,7 @@
               <w:rPr>
                 <w:sz w:val="19"/>
               </w:rPr>
+              <w:t>Es parte del Sprint 3 (HU-066 y HU-067), con el mismo mecanismo de QR resuelto en el servidor.</w:t>
             </w:r>
           </w:p>
         </w:tc>
@@ -1129,6 +1103,7 @@
               <w:rPr>
                 <w:sz w:val="19"/>
               </w:rPr>
+              <w:t>La administradora valora ver la vigencia y el pago de la suscripción; pide que el aviso de vencimiento aparezca antes del bloqueo.</w:t>
             </w:r>
           </w:p>
         </w:tc>
@@ -1142,6 +1117,37 @@
               <w:rPr>
                 <w:sz w:val="19"/>
               </w:rPr>
+              <w:t>Se muestra en el encabezado cuántos días faltan para el vencimiento (próximos pasos).</w:t>
+            </w:r>
+          </w:p>
+        </w:tc>
+      </w:tr>
+      <w:tr>
+        <w:tc>
+          <w:tcPr>
+            <w:tcW w:type="dxa" w:w="4819"/>
+          </w:tcPr>
+          <w:p>
+            <w:r/>
+            <w:r>
+              <w:rPr>
+                <w:sz w:val="19"/>
+              </w:rPr>
+              <w:t>El Jefe de Mantenimiento quiere que la serie histórica de las variables le avise cuando algo se sale de lo normal, sin tener que mirar el gráfico.</w:t>
+            </w:r>
+          </w:p>
+        </w:tc>
+        <w:tc>
+          <w:tcPr>
+            <w:tcW w:type="dxa" w:w="4535"/>
+          </w:tcPr>
+          <w:p>
+            <w:r/>
+            <w:r>
+              <w:rPr>
+                <w:sz w:val="19"/>
+              </w:rPr>
+              <w:t>Los avisos automáticos entran en el Sprint 3 (HU-077) y la predicción en el Sprint 6 (SIGMA AI).</w:t>
             </w:r>
           </w:p>
         </w:tc>
@@ -1162,16 +1168,62 @@
     </w:p>
     <w:p>
       <w:pPr>
-        <w:spacing w:after="120"/>
+        <w:pStyle w:val="ListBullet"/>
+        <w:spacing w:after="60"/>
       </w:pPr>
       <w:r>
         <w:rPr>
-          <w:b w:val="0"/>
-          <w:i/>
-          <w:color w:val="9A6A00"/>
           <w:sz w:val="21"/>
         </w:rPr>
-        <w:t>[Completar en la reunión]</w:t>
+        <w:t>Se partió por los maestros —tipos, modelos y atributos— y eso permitió registrar activos sin rehacer nada.</w:t>
+      </w:r>
+    </w:p>
+    <w:p>
+      <w:pPr>
+        <w:pStyle w:val="ListBullet"/>
+        <w:spacing w:after="60"/>
+      </w:pPr>
+      <w:r>
+        <w:rPr>
+          <w:sz w:val="21"/>
+        </w:rPr>
+        <w:t>El QR de la posición se resuelve en el servidor: el mismo código sirve para la web y para la app, y el Sprint 3 lo reutiliza para bodegas y repuestos.</w:t>
+      </w:r>
+    </w:p>
+    <w:p>
+      <w:pPr>
+        <w:pStyle w:val="ListBullet"/>
+        <w:spacing w:after="60"/>
+      </w:pPr>
+      <w:r>
+        <w:rPr>
+          <w:sz w:val="21"/>
+        </w:rPr>
+        <w:t>Las pruebas encontraron defectos de verdad antes de la Review: la serie duplicada se dejaba grabar dentro del cliente y el motivo vacío pasaba por la API aunque la pantalla lo exigía. Los dos se corrigieron.</w:t>
+      </w:r>
+    </w:p>
+    <w:p>
+      <w:pPr>
+        <w:pStyle w:val="ListBullet"/>
+        <w:spacing w:after="60"/>
+      </w:pPr>
+      <w:r>
+        <w:rPr>
+          <w:sz w:val="21"/>
+        </w:rPr>
+        <w:t>Se priorizó la sincronización, la historia de 13 puntos del Sprint, por sobre el módulo comercial, y las dos se cerraron.</w:t>
+      </w:r>
+    </w:p>
+    <w:p>
+      <w:pPr>
+        <w:pStyle w:val="ListBullet"/>
+        <w:spacing w:after="60"/>
+      </w:pPr>
+      <w:r>
+        <w:rPr>
+          <w:sz w:val="21"/>
+        </w:rPr>
+        <w:t>Las 18 historias web del Sprint quedaron aceptadas el mismo día de la Review.</w:t>
       </w:r>
     </w:p>
     <w:p>
@@ -1184,16 +1236,38 @@
     </w:p>
     <w:p>
       <w:pPr>
-        <w:spacing w:after="120"/>
+        <w:pStyle w:val="ListBullet"/>
+        <w:spacing w:after="60"/>
       </w:pPr>
       <w:r>
         <w:rPr>
-          <w:b w:val="0"/>
-          <w:i/>
-          <w:color w:val="9A6A00"/>
           <w:sz w:val="21"/>
         </w:rPr>
-        <w:t>[Completar en la reunión]</w:t>
+        <w:t>La carga quedó cargada a Emilio en la parte web (96 tareas contra 60 de Bryan y 40 de Catalina).</w:t>
+      </w:r>
+    </w:p>
+    <w:p>
+      <w:pPr>
+        <w:pStyle w:val="ListBullet"/>
+        <w:spacing w:after="60"/>
+      </w:pPr>
+      <w:r>
+        <w:rPr>
+          <w:sz w:val="21"/>
+        </w:rPr>
+        <w:t>Dos reglas de negocio estaban solo en la pantalla y no en el servidor; se encontraron probando, no revisando.</w:t>
+      </w:r>
+    </w:p>
+    <w:p>
+      <w:pPr>
+        <w:pStyle w:val="ListBullet"/>
+        <w:spacing w:after="60"/>
+      </w:pPr>
+      <w:r>
+        <w:rPr>
+          <w:sz w:val="21"/>
+        </w:rPr>
+        <w:t>Las horas reales registradas (54.2 h) quedaron muy por debajo de las estimadas (95.5 h): no todos anotan las horas al cerrar una tarea, así que la estimación no se puede calibrar.</w:t>
       </w:r>
     </w:p>
     <w:p>
@@ -1202,6 +1276,19 @@
       </w:pPr>
       <w:r>
         <w:t>5. Qué vamos a cambiar · acuerdos</w:t>
+      </w:r>
+    </w:p>
+    <w:p>
+      <w:pPr>
+        <w:spacing w:after="120"/>
+      </w:pPr>
+      <w:r>
+        <w:rPr>
+          <w:b w:val="0"/>
+          <w:i/>
+          <w:sz w:val="21"/>
+        </w:rPr>
+        <w:t>Cada acuerdo tiene un dueño y una fecha; se revisan en la próxima retrospectiva.</w:t>
       </w:r>
     </w:p>
     <w:tbl>
@@ -1315,7 +1402,7 @@
               <w:rPr>
                 <w:sz w:val="18"/>
               </w:rPr>
-              <w:t>[Completar]</w:t>
+              <w:t>Toda regla de negocio que exige una pantalla se valida también en su SP; es criterio de revisión de código.</w:t>
             </w:r>
           </w:p>
         </w:tc>
@@ -1329,6 +1416,7 @@
               <w:rPr>
                 <w:sz w:val="18"/>
               </w:rPr>
+              <w:t>Bryan Chávez</w:t>
             </w:r>
           </w:p>
         </w:tc>
@@ -1342,6 +1430,7 @@
               <w:rPr>
                 <w:sz w:val="18"/>
               </w:rPr>
+              <w:t>Desde el Sprint 3</w:t>
             </w:r>
           </w:p>
         </w:tc>
@@ -1371,6 +1460,7 @@
               <w:rPr>
                 <w:sz w:val="18"/>
               </w:rPr>
+              <w:t>Balancear la carga en el Sprint Planning 3 para que ninguna persona concentre la parte web o la de base de datos, y anotar las horas reales al cerrar cada tarea.</w:t>
             </w:r>
           </w:p>
         </w:tc>
@@ -1384,6 +1474,7 @@
               <w:rPr>
                 <w:sz w:val="18"/>
               </w:rPr>
+              <w:t>Emilio Fuentes</w:t>
             </w:r>
           </w:p>
         </w:tc>
@@ -1397,6 +1488,7 @@
               <w:rPr>
                 <w:sz w:val="18"/>
               </w:rPr>
+              <w:t>Sprint Planning 3 · 30-09-2026</w:t>
             </w:r>
           </w:p>
         </w:tc>
@@ -1417,16 +1509,26 @@
     </w:p>
     <w:p>
       <w:pPr>
-        <w:spacing w:after="120"/>
+        <w:pStyle w:val="ListBullet"/>
+        <w:spacing w:after="60"/>
       </w:pPr>
       <w:r>
         <w:rPr>
-          <w:b w:val="0"/>
-          <w:i/>
-          <w:color w:val="9A6A00"/>
           <w:sz w:val="21"/>
         </w:rPr>
-        <w:t>[Si los hay]</w:t>
+        <w:t>Una historia no se da por terminada si alguna de sus reglas de negocio se valida solo en la pantalla (acuerdo A8).</w:t>
+      </w:r>
+    </w:p>
+    <w:p>
+      <w:pPr>
+        <w:pStyle w:val="ListBullet"/>
+        <w:spacing w:after="60"/>
+      </w:pPr>
+      <w:r>
+        <w:rPr>
+          <w:sz w:val="21"/>
+        </w:rPr>
+        <w:t>Al cerrar una tarea se registran sus horas reales.</w:t>
       </w:r>
     </w:p>
     <w:p>
@@ -1435,6 +1537,19 @@
       </w:pPr>
       <w:r>
         <w:t>7. Cierre</w:t>
+      </w:r>
+    </w:p>
+    <w:p>
+      <w:pPr>
+        <w:spacing w:after="120"/>
+      </w:pPr>
+      <w:r>
+        <w:rPr>
+          <w:b w:val="0"/>
+          <w:i w:val="0"/>
+          <w:sz w:val="21"/>
+        </w:rPr>
+        <w:t>El equipo cierra el Sprint 2 con el incremento web aceptado y la carga como tema principal a corregir en el Sprint 3.</w:t>
       </w:r>
     </w:p>
     <w:tbl>

</xml_diff>